<commit_message>
Add contact details to resume
Co-Authored-By: Claude Sonnet 5.5 <noreply@anthropic.com>
Claude-Session: https://claude.ai/code/session_016L5yfe7CznBFEBXvkqRypQ
</commit_message>
<xml_diff>
--- a/Kyaw_Soe_Han_Resume.docx
+++ b/Kyaw_Soe_Han_Resume.docx
@@ -79,10 +79,10 @@
         <w:rPr>
           <w:rFonts w:ascii="Calibri" w:cs="Calibri" w:eastAsia="Calibri" w:hAnsi="Calibri"/>
           <w:color w:val="6B6B6B"/>
-          <w:sz w:val="19"/>
-          <w:szCs w:val="19"/>
-        </w:rPr>
-        <w:t xml:space="preserve">Phone: ____________________   |   Email: ____________________________   |   LinkedIn: ____________________</w:t>
+          <w:sz w:val="20"/>
+          <w:szCs w:val="20"/>
+        </w:rPr>
+        <w:t xml:space="preserve">+44 7774 417864   |   kshan227xz@gmail.com</w:t>
       </w:r>
     </w:p>
     <w:p>

</xml_diff>